<commit_message>
refactor: simplify document processing architecture
</commit_message>
<xml_diff>
--- a/templates/MRM/template.docx
+++ b/templates/MRM/template.docx
@@ -14,8 +14,54 @@
       </w:r>
     </w:p>
     <w:p>
+      <w:pPr>
+        <w:rPr>
+          <w:b/>
+          <w:bCs/>
+          <w:i/>
+          <w:iCs/>
+          <w:color w:val="EE0000"/>
+          <w:sz w:val="40"/>
+          <w:szCs w:val="40"/>
+        </w:rPr>
+      </w:pPr>
       <w:r>
-        <w:t>{{companyName}}</w:t>
+        <w:rPr>
+          <w:b/>
+          <w:bCs/>
+          <w:i/>
+          <w:iCs/>
+          <w:color w:val="EE0000"/>
+          <w:sz w:val="40"/>
+          <w:szCs w:val="40"/>
+        </w:rPr>
+        <w:t>{{</w:t>
+      </w:r>
+      <w:proofErr w:type="spellStart"/>
+      <w:r>
+        <w:rPr>
+          <w:b/>
+          <w:bCs/>
+          <w:i/>
+          <w:iCs/>
+          <w:color w:val="EE0000"/>
+          <w:sz w:val="40"/>
+          <w:szCs w:val="40"/>
+        </w:rPr>
+        <w:t>companyName</w:t>
+      </w:r>
+      <w:proofErr w:type="spellEnd"/>
+      <w:r>
+        <w:rPr>
+          <w:b/>
+          <w:bCs/>
+          <w:i/>
+          <w:iCs/>
+          <w:color w:val="EE0000"/>
+          <w:sz w:val="40"/>
+          <w:szCs w:val="40"/>
+        </w:rPr>
+        <w:t>}}</w:t>
       </w:r>
     </w:p>
     <w:p/>

</xml_diff>

<commit_message>
feat: support image placeholder replacement in Word templates
</commit_message>
<xml_diff>
--- a/templates/MRM/template.docx
+++ b/templates/MRM/template.docx
@@ -35,33 +35,7 @@
           <w:sz w:val="40"/>
           <w:szCs w:val="40"/>
         </w:rPr>
-        <w:t>{{</w:t>
-      </w:r>
-      <w:proofErr w:type="spellStart"/>
-      <w:r>
-        <w:rPr>
-          <w:b/>
-          <w:bCs/>
-          <w:i/>
-          <w:iCs/>
-          <w:color w:val="EE0000"/>
-          <w:sz w:val="40"/>
-          <w:szCs w:val="40"/>
-        </w:rPr>
-        <w:t>companyName</w:t>
-      </w:r>
-      <w:proofErr w:type="spellEnd"/>
-      <w:r>
-        <w:rPr>
-          <w:b/>
-          <w:bCs/>
-          <w:i/>
-          <w:iCs/>
-          <w:color w:val="EE0000"/>
-          <w:sz w:val="40"/>
-          <w:szCs w:val="40"/>
-        </w:rPr>
-        <w:t>}}</w:t>
+        <w:t>{{companyName}}</w:t>
       </w:r>
     </w:p>
     <w:p/>
@@ -73,6 +47,16 @@
     <w:p>
       <w:r>
         <w:t>{{address}}</w:t>
+      </w:r>
+    </w:p>
+    <w:p/>
+    <w:p/>
+    <w:p>
+      <w:r>
+        <w:t>{{logo}</w:t>
+      </w:r>
+      <w:r>
+        <w:t>}</w:t>
       </w:r>
     </w:p>
     <w:sectPr>

</xml_diff>